<commit_message>
Manuscript: italic in vitro/in vivo, Conflicts of Interest heading, en-dash panel ranges; Supplementary: safe caption/table/equation/affiliation fixes
Co-Authored-By: Claude Sonnet 5.5 <noreply@anthropic.com>
Claude-Session: https://claude.ai/code/session_01Y1g9vByMLTE8eGJ9K81zt6
</commit_message>
<xml_diff>
--- a/Manuscript_AS_formatted.docx
+++ b/Manuscript_AS_formatted.docx
@@ -310,7 +310,18 @@
         </w:rPr>
       </w:pPr>
       <w:r>
-        <w:t>Zinc (Zn) is a promising biodegradable metal for temporary implants, yet predictive computational frameworks for its degradation under physiological conditions remain limited. In this study, a three-dimensional (3D) mechanistic reaction-diffusion model is developed by coupling oxygen reduction reaction (ORR) kinetics, mass transport, corrosion-product evolution, and moving-interface tracking. Initial sensitivity analysis demonstrates that dissolved oxygen availability primarily controls Zn biodegradation. Calibrated using three effective kinetic parameters against literature immersion mass-loss data over 14 days, the model predicts the 28-day mass-loss evolution measured in this study without refitting, yielding a root-mean-square error (RMSE) of 0.0159%. The simulations reveal a self-limiting mechanism in which corrosion-product accumulation progressively restricts oxygen transport to the metal surface, driving a transition from reaction-controlled to diffusion-controlled degradation. When applied without geometry-specific recalibration to a six-crown Zn stent, the model predicts approximately 6% mass loss after one month, consistent in magnitude with reported in vivo observations, and captures crown-localized degradation driven by geometry-dependent oxygen transport. By linking implant geometry to degradation rate and spatial morphology, the framework provides a low-dimensional, mechanistic basis for predicting Zn implant degradation and supports data-driven optimization and degradation-informed implant design.</w:t>
+        <w:rPr/>
+        <w:t xml:space="preserve">Zinc (Zn) is a promising biodegradable metal for temporary implants, yet predictive computational frameworks for its degradation under physiological conditions remain limited. In this study, a three-dimensional (3D) mechanistic reaction-diffusion model is developed by coupling oxygen reduction reaction (ORR) kinetics, mass transport, corrosion-product evolution, and moving-interface tracking. Initial sensitivity analysis demonstrates that dissolved oxygen availability primarily controls Zn biodegradation. Calibrated using three effective kinetic parameters against literature immersion mass-loss data over 14 days, the model predicts the 28-day mass-loss evolution measured in this study without refitting, yielding a root-mean-square error (RMSE) of 0.0159%. The simulations reveal a self-limiting mechanism in which corrosion-product accumulation progressively restricts oxygen transport to the metal surface, driving a transition from reaction-controlled to diffusion-controlled degradation. When applied without geometry-specific recalibration to a six-crown Zn stent, the model predicts approximately 6% mass loss after one month, consistent in magnitude with reported </w:t>
+      </w:r>
+      <w:r>
+        <w:rPr>
+          <w:i/>
+        </w:rPr>
+        <w:t xml:space="preserve">in vivo</w:t>
+      </w:r>
+      <w:r>
+        <w:rPr/>
+        <w:t xml:space="preserve"> observations, and captures crown-localized degradation driven by geometry-dependent oxygen transport. By linking implant geometry to degradation rate and spatial morphology, the framework provides a low-dimensional, mechanistic basis for predicting Zn implant degradation and supports data-driven optimization and degradation-informed implant design.</w:t>
       </w:r>
     </w:p>
     <w:p>
@@ -787,10 +798,10 @@
       </w:r>
       <w:r>
         <w:rPr>
-          <w:i w:val="0"/>
-          <w:lang w:val="en-US"/>
-        </w:rPr>
-        <w:t>in vitro</w:t>
+          <w:i/>
+          <w:lang w:val="en-US"/>
+        </w:rPr>
+        <w:t xml:space="preserve">in vitro</w:t>
       </w:r>
       <w:r>
         <w:rPr>
@@ -800,10 +811,10 @@
       </w:r>
       <w:r>
         <w:rPr>
-          <w:i w:val="0"/>
-          <w:lang w:val="en-US"/>
-        </w:rPr>
-        <w:t>in vivo</w:t>
+          <w:i/>
+          <w:lang w:val="en-US"/>
+        </w:rPr>
+        <w:t xml:space="preserve">in vivo</w:t>
       </w:r>
       <w:r>
         <w:rPr>
@@ -1791,10 +1802,10 @@
       <w:r>
         <w:rPr>
           <w:rFonts w:cs="Times New Roman"/>
-          <w:i w:val="0"/>
-          <w:lang w:val="en-US"/>
-        </w:rPr>
-        <w:t>in vitro</w:t>
+          <w:i/>
+          <w:lang w:val="en-US"/>
+        </w:rPr>
+        <w:t xml:space="preserve">in vitro</w:t>
       </w:r>
       <w:r>
         <w:rPr>
@@ -3625,10 +3636,10 @@
       <w:r>
         <w:rPr>
           <w:rFonts w:cs="Times New Roman"/>
-          <w:i w:val="0"/>
-          <w:lang w:val="en-US"/>
-        </w:rPr>
-        <w:t>in vivo</w:t>
+          <w:i/>
+          <w:lang w:val="en-US"/>
+        </w:rPr>
+        <w:t xml:space="preserve">in vivo</w:t>
       </w:r>
       <w:r>
         <w:rPr>
@@ -15458,10 +15469,10 @@
       </w:r>
       <w:r>
         <w:rPr>
-          <w:i w:val="0"/>
-          <w:lang w:val="en-US"/>
-        </w:rPr>
-        <w:t>in vivo</w:t>
+          <w:i/>
+          <w:lang w:val="en-US"/>
+        </w:rPr>
+        <w:t xml:space="preserve">in vivo</w:t>
       </w:r>
       <w:r>
         <w:rPr>
@@ -18070,7 +18081,7 @@
           <w:bCs/>
           <w:lang w:val="en-US"/>
         </w:rPr>
-        <w:t>a-c</w:t>
+        <w:t>a–c</w:t>
       </w:r>
       <w:r>
         <w:rPr>
@@ -18612,7 +18623,7 @@
           <w:bCs/>
           <w:lang w:val="en-US"/>
         </w:rPr>
-        <w:t>d-f</w:t>
+        <w:t>d–f</w:t>
       </w:r>
       <w:r>
         <w:rPr>
@@ -19290,7 +19301,7 @@
           <w:bCs/>
           <w:lang w:val="en-US"/>
         </w:rPr>
-        <w:t>g-i</w:t>
+        <w:t>g–i</w:t>
       </w:r>
       <w:r>
         <w:rPr>
@@ -19819,7 +19830,7 @@
         <w:rPr>
           <w:lang w:val="en-US"/>
         </w:rPr>
-        <w:t xml:space="preserve"> Local parameter sweeps of kinetic parameters. Panels (a-c) show cumulative mass loss (%), panels (d-f) show film coverage (%), and panels (g-</w:t>
+        <w:t xml:space="preserve"> Local parameter sweeps of kinetic parameters. Panels (a–c) show cumulative mass loss (%), panels (d–f) show film coverage (%), and panels (g-</w:t>
       </w:r>
       <w:proofErr w:type="spellStart"/>
       <w:r>
@@ -19982,10 +19993,10 @@
       </w:pPr>
       <w:r>
         <w:rPr>
-          <w:i w:val="0"/>
-          <w:lang w:val="en-US"/>
-        </w:rPr>
-        <w:t>In Vitro</w:t>
+          <w:i/>
+          <w:lang w:val="en-US"/>
+        </w:rPr>
+        <w:t xml:space="preserve">In Vitro</w:t>
       </w:r>
       <w:r>
         <w:rPr>
@@ -22482,10 +22493,10 @@
       </w:r>
       <w:r>
         <w:rPr>
-          <w:i w:val="0"/>
-          <w:lang w:val="en-US"/>
-        </w:rPr>
-        <w:t>in vivo</w:t>
+          <w:i/>
+          <w:lang w:val="en-US"/>
+        </w:rPr>
+        <w:t xml:space="preserve">in vivo</w:t>
       </w:r>
       <w:r>
         <w:rPr>
@@ -22538,10 +22549,10 @@
       </w:r>
       <w:r>
         <w:rPr>
-          <w:i w:val="0"/>
-          <w:lang w:val="en-US"/>
-        </w:rPr>
-        <w:t>in vivo</w:t>
+          <w:i/>
+          <w:lang w:val="en-US"/>
+        </w:rPr>
+        <w:t xml:space="preserve">in vivo</w:t>
       </w:r>
       <w:r>
         <w:rPr>
@@ -22551,10 +22562,10 @@
       </w:r>
       <w:r>
         <w:rPr>
-          <w:i w:val="0"/>
-          <w:lang w:val="en-US"/>
-        </w:rPr>
-        <w:t>in vivo</w:t>
+          <w:i/>
+          <w:lang w:val="en-US"/>
+        </w:rPr>
+        <w:t xml:space="preserve">in vivo</w:t>
       </w:r>
       <w:r>
         <w:rPr>
@@ -24309,10 +24320,10 @@
       </w:r>
       <w:r>
         <w:rPr>
-          <w:i w:val="0"/>
-          <w:lang w:val="en-US"/>
-        </w:rPr>
-        <w:t>in vivo</w:t>
+          <w:i/>
+          <w:lang w:val="en-US"/>
+        </w:rPr>
+        <w:t xml:space="preserve">in vivo</w:t>
       </w:r>
       <w:r>
         <w:rPr>
@@ -24346,10 +24357,10 @@
       </w:r>
       <w:r>
         <w:rPr>
-          <w:i w:val="0"/>
-          <w:lang w:val="en-US"/>
-        </w:rPr>
-        <w:t>in vivo</w:t>
+          <w:i/>
+          <w:lang w:val="en-US"/>
+        </w:rPr>
+        <w:t xml:space="preserve">in vivo</w:t>
       </w:r>
       <w:r>
         <w:rPr>
@@ -24727,7 +24738,7 @@
           <w:bCs/>
           <w:i w:val="0"/>
         </w:rPr>
-        <w:t>Declaration of competing interests</w:t>
+        <w:t>Conflicts of Interest</w:t>
       </w:r>
     </w:p>
     <w:p>

</xml_diff>

<commit_message>
Manuscript: equation citations, center-to-center, DOI link, Availability Statement headings; Supplementary: add software/method references and citations
Co-Authored-By: Claude Sonnet 5.5 <noreply@anthropic.com>
Claude-Session: https://claude.ai/code/session_01Y1g9vByMLTE8eGJ9K81zt6
</commit_message>
<xml_diff>
--- a/Manuscript_AS_formatted.docx
+++ b/Manuscript_AS_formatted.docx
@@ -8670,7 +8670,7 @@
           <w:bCs/>
           <w:lang w:val="en-US"/>
         </w:rPr>
-        <w:t>Equation 17</w:t>
+        <w:t xml:space="preserve">Equation (17)</w:t>
       </w:r>
       <w:r>
         <w:rPr>
@@ -9262,23 +9262,23 @@
           <w:bCs/>
           <w:lang w:val="en-US"/>
         </w:rPr>
-        <w:t>Equation 1</w:t>
-      </w:r>
-      <w:r>
-        <w:rPr>
-          <w:rFonts w:cs="Times New Roman"/>
-          <w:lang w:val="en-US"/>
-        </w:rPr>
-        <w:t xml:space="preserve"> and </w:t>
-      </w:r>
-      <w:r>
-        <w:rPr>
-          <w:rFonts w:cs="Times New Roman"/>
-          <w:b/>
-          <w:bCs/>
-          <w:lang w:val="en-US"/>
-        </w:rPr>
-        <w:t>Equation 2</w:t>
+        <w:t xml:space="preserve">Equation (1) and Equation (2)</w:t>
+      </w:r>
+      <w:r>
+        <w:rPr>
+          <w:rFonts w:cs="Times New Roman"/>
+          <w:lang w:val="en-US"/>
+        </w:rPr>
+        <w:t xml:space="preserve"/>
+      </w:r>
+      <w:r>
+        <w:rPr>
+          <w:rFonts w:cs="Times New Roman"/>
+          <w:b/>
+          <w:bCs/>
+          <w:lang w:val="en-US"/>
+        </w:rPr>
+        <w:t xml:space="preserve"/>
       </w:r>
       <w:r>
         <w:rPr>
@@ -23911,21 +23911,21 @@
         <w:rPr>
           <w:lang w:val="en-US"/>
         </w:rPr>
-        <w:t>centre</w:t>
+        <w:t xml:space="preserve">center-to-center</w:t>
       </w:r>
       <w:proofErr w:type="spellEnd"/>
       <w:r>
         <w:rPr>
           <w:lang w:val="en-US"/>
         </w:rPr>
-        <w:t>-to-</w:t>
+        <w:t xml:space="preserve"/>
       </w:r>
       <w:proofErr w:type="spellStart"/>
       <w:r>
         <w:rPr>
           <w:lang w:val="en-US"/>
         </w:rPr>
-        <w:t>centre</w:t>
+        <w:t xml:space="preserve"/>
       </w:r>
       <w:proofErr w:type="spellEnd"/>
       <w:r>
@@ -24776,7 +24776,7 @@
           <w:bCs/>
           <w:i w:val="0"/>
         </w:rPr>
-        <w:t>Code Availability</w:t>
+        <w:t>Code Availability Statement</w:t>
       </w:r>
     </w:p>
     <w:p>
@@ -24793,8 +24793,18 @@
         <w:t xml:space="preserve">: </w:t>
       </w:r>
       <w:r>
-        <w:t>10.5281/zenodo.23053518</w:t>
-      </w:r>
+        <w:t xml:space="preserve"/>
+      </w:r>
+      <w:hyperlink r:id="rId27">
+        <w:r>
+          <w:rPr>
+            <w:rStyle w:val="Hyperlink"/>
+            <w:color w:val="0563C1"/>
+            <w:u w:val="single"/>
+          </w:rPr>
+          <w:t>https://doi.org/10.5281/zenodo.23053518</w:t>
+        </w:r>
+      </w:hyperlink>
     </w:p>
     <w:p>
       <w:pPr>
@@ -24820,7 +24830,7 @@
           <w:bCs/>
           <w:i w:val="0"/>
         </w:rPr>
-        <w:t>Data availability</w:t>
+        <w:t>Data Availability Statement</w:t>
       </w:r>
       <w:r>
         <w:rPr>
@@ -24828,7 +24838,7 @@
           <w:bCs/>
           <w:i w:val="0"/>
         </w:rPr>
-        <w:t xml:space="preserve"> </w:t>
+        <w:t xml:space="preserve"/>
       </w:r>
     </w:p>
     <w:p>

</xml_diff>

<commit_message>
Manuscript: Figure 1 caption panel descriptions
Co-Authored-By: Claude Sonnet 5.5 <noreply@anthropic.com>
Claude-Session: https://claude.ai/code/session_01Y1g9vByMLTE8eGJ9K81zt6
</commit_message>
<xml_diff>
--- a/Manuscript_AS_formatted.docx
+++ b/Manuscript_AS_formatted.docx
@@ -1701,6 +1701,51 @@
           <w:lang w:val="en-US"/>
         </w:rPr>
         <w:t>.</w:t>
+      </w:r>
+      <w:r>
+        <w:rPr>
+          <w:lang w:val="en-US"/>
+        </w:rPr>
+        <w:t xml:space="preserve"> (a) Reaction–diffusion model coupling species transport and corrosion-film evolution with moving-interface tracking; (b) calibration of the three effective kinetic parameters (k</w:t>
+      </w:r>
+      <w:r>
+        <w:rPr>
+          <w:lang w:val="en-US"/>
+          <w:vertAlign w:val="subscript"/>
+        </w:rPr>
+        <w:t xml:space="preserve">f</w:t>
+      </w:r>
+      <w:r>
+        <w:rPr>
+          <w:lang w:val="en-US"/>
+        </w:rPr>
+        <w:t xml:space="preserve">, k</w:t>
+      </w:r>
+      <w:r>
+        <w:rPr>
+          <w:lang w:val="en-US"/>
+          <w:vertAlign w:val="subscript"/>
+        </w:rPr>
+        <w:t xml:space="preserve">d</w:t>
+      </w:r>
+      <w:r>
+        <w:rPr>
+          <w:lang w:val="en-US"/>
+        </w:rPr>
+        <w:t xml:space="preserve">, k</w:t>
+      </w:r>
+      <w:r>
+        <w:rPr>
+          <w:lang w:val="en-US"/>
+          <w:vertAlign w:val="subscript"/>
+        </w:rPr>
+        <w:t xml:space="preserve">ORR</w:t>
+      </w:r>
+      <w:r>
+        <w:rPr>
+          <w:lang w:val="en-US"/>
+        </w:rPr>
+        <w:t xml:space="preserve">) against literature mass-loss data (0–336 h); (c) validation against the mass loss measured in this study (0–672 h) for Ø10 × 2 mm discs; and (d) model predictions for a six-crown Zn stent.</w:t>
       </w:r>
     </w:p>
     <w:p>

</xml_diff>

<commit_message>
Rule A justification on physical grounds (SI S1) and pointer in main text
Co-Authored-By: Claude Sonnet 5.5 <noreply@anthropic.com>
Claude-Session: https://claude.ai/code/session_01Y1g9vByMLTE8eGJ9K81zt6
</commit_message>
<xml_diff>
--- a/Manuscript_AS_formatted.docx
+++ b/Manuscript_AS_formatted.docx
@@ -10300,6 +10300,13 @@
           <w:lang w:val="en-US"/>
         </w:rPr>
         <w:t>.</w:t>
+      </w:r>
+      <w:r>
+        <w:rPr>
+          <w:rFonts w:cs="Times New Roman"/>
+          <w:lang w:val="en-US"/>
+        </w:rPr>
+        <w:t xml:space="preserve"> The hard-minimum rule was selected over blended alternatives on physical grounds, as detailed in Section S1 of the Supporting Information.</w:t>
       </w:r>
     </w:p>
     <w:p>

</xml_diff>

<commit_message>
Manuscript: plain pointer to Section S1 only
Co-Authored-By: Claude Sonnet 5.5 <noreply@anthropic.com>
Claude-Session: https://claude.ai/code/session_01Y1g9vByMLTE8eGJ9K81zt6
</commit_message>
<xml_diff>
--- a/Manuscript_AS_formatted.docx
+++ b/Manuscript_AS_formatted.docx
@@ -10299,14 +10299,7 @@
           <w:rFonts w:cs="Times New Roman"/>
           <w:lang w:val="en-US"/>
         </w:rPr>
-        <w:t>.</w:t>
-      </w:r>
-      <w:r>
-        <w:rPr>
-          <w:rFonts w:cs="Times New Roman"/>
-          <w:lang w:val="en-US"/>
-        </w:rPr>
-        <w:t xml:space="preserve"> The hard-minimum rule was selected over blended alternatives on physical grounds, as detailed in Section S1 of the Supporting Information.</w:t>
+        <w:t xml:space="preserve"> (Section S1, Supporting Information).</w:t>
       </w:r>
     </w:p>
     <w:p>

</xml_diff>

<commit_message>
Manuscript: cite Supporting Information sections (S2-S7), add [35] and S4-S6 to future-work sentence
Co-Authored-By: Claude Sonnet 5.5 <noreply@anthropic.com>
Claude-Session: https://claude.ai/code/session_01Y1g9vByMLTE8eGJ9K81zt6
</commit_message>
<xml_diff>
--- a/Manuscript_AS_formatted.docx
+++ b/Manuscript_AS_formatted.docx
@@ -10374,29 +10374,29 @@
         <w:rPr>
           <w:lang w:val="en-US"/>
         </w:rPr>
-        <w:t>To resolve steep concentration gradients near the corrosion front, distance-based mesh refinement was applied around the metal-electrolyte interface, with progressively coarser elements away from the surface. Mesh convergence analysis identified a final mesh containing 18.9 million tetrahedral elements, for which predicted mass loss changed by less than 1% with further refinement (</w:t>
-      </w:r>
-      <w:r>
-        <w:rPr>
-          <w:b/>
-          <w:bCs/>
-          <w:lang w:val="en-US"/>
-        </w:rPr>
-        <w:t>Table S</w:t>
-      </w:r>
-      <w:r>
-        <w:rPr>
-          <w:b/>
-          <w:bCs/>
-          <w:lang w:val="en-US"/>
-        </w:rPr>
-        <w:t>2</w:t>
-      </w:r>
-      <w:r>
-        <w:rPr>
-          <w:lang w:val="en-US"/>
-        </w:rPr>
-        <w:t>).</w:t>
+        <w:t xml:space="preserve">To resolve steep concentration gradients near the corrosion front, distance-based mesh refinement was applied around the metal-electrolyte interface, with progressively coarser elements away from the surface. Mesh convergence analysis identified a final mesh containing 18.9 million tetrahedral elements, for which predicted mass loss changed by less than 1% with further refinement (Section S2)</w:t>
+      </w:r>
+      <w:r>
+        <w:rPr>
+          <w:b/>
+          <w:bCs/>
+          <w:lang w:val="en-US"/>
+        </w:rPr>
+        <w:t xml:space="preserve"/>
+      </w:r>
+      <w:r>
+        <w:rPr>
+          <w:b/>
+          <w:bCs/>
+          <w:lang w:val="en-US"/>
+        </w:rPr>
+        <w:t xml:space="preserve"/>
+      </w:r>
+      <w:r>
+        <w:rPr>
+          <w:lang w:val="en-US"/>
+        </w:rPr>
+        <w:t xml:space="preserve">.</w:t>
       </w:r>
     </w:p>
     <w:p>
@@ -10611,27 +10611,27 @@
           <w:bCs/>
           <w:lang w:val="en-US"/>
         </w:rPr>
-        <w:t>Table S</w:t>
-      </w:r>
-      <w:r>
-        <w:rPr>
-          <w:b/>
-          <w:bCs/>
-          <w:lang w:val="en-US"/>
-        </w:rPr>
-        <w:t>4</w:t>
-      </w:r>
-      <w:r>
-        <w:rPr>
-          <w:lang w:val="en-US"/>
-        </w:rPr>
-        <w:t xml:space="preserve"> </w:t>
-      </w:r>
-      <w:r>
-        <w:rPr>
-          <w:lang w:val="en-US"/>
-        </w:rPr>
-        <w:t>lists the computational parameters used in the simulations.</w:t>
+        <w:t xml:space="preserve">Section S3 (Supporting Information) lists the computational parameters</w:t>
+      </w:r>
+      <w:r>
+        <w:rPr>
+          <w:b/>
+          <w:bCs/>
+          <w:lang w:val="en-US"/>
+        </w:rPr>
+        <w:t xml:space="preserve"/>
+      </w:r>
+      <w:r>
+        <w:rPr>
+          <w:lang w:val="en-US"/>
+        </w:rPr>
+        <w:t xml:space="preserve"/>
+      </w:r>
+      <w:r>
+        <w:rPr>
+          <w:lang w:val="en-US"/>
+        </w:rPr>
+        <w:t xml:space="preserve"> used in the simulations.</w:t>
       </w:r>
       <w:r>
         <w:rPr>
@@ -14765,33 +14765,33 @@
         <w:rPr>
           <w:lang w:val="en-US"/>
         </w:rPr>
-        <w:t>To identify the dominant factors governing Zn biodegradation, a global sensitivity analysis (GSA) was performed using the Morris elementary effects method. Eight parameters associated with oxygen transport, corrosion-product evolution, electrochemical kinetics, and ionic diffusion were evaluated for their influence on cumulative mass loss</w:t>
-      </w:r>
-      <w:r>
-        <w:rPr>
-          <w:lang w:val="en-US"/>
-        </w:rPr>
-        <w:t xml:space="preserve"> (</w:t>
-      </w:r>
-      <w:r>
-        <w:rPr>
-          <w:b/>
-          <w:bCs/>
-          <w:lang w:val="en-US"/>
-        </w:rPr>
-        <w:t>Table S5</w:t>
-      </w:r>
-      <w:r>
-        <w:rPr>
-          <w:lang w:val="en-US"/>
-        </w:rPr>
-        <w:t>)</w:t>
-      </w:r>
-      <w:r>
-        <w:rPr>
-          <w:lang w:val="en-US"/>
-        </w:rPr>
-        <w:t xml:space="preserve">. </w:t>
+        <w:t xml:space="preserve">To identify the dominant factors governing Zn biodegradation, a global sensitivity analysis (GSA) was performed using the Morris elementary effects method. Eight parameters associated with oxygen transport, corrosion-product evolution, electrochemical kinetics, and ionic diffusion were evaluated for their influence on cumulative mass loss (Section S4).</w:t>
+      </w:r>
+      <w:r>
+        <w:rPr>
+          <w:lang w:val="en-US"/>
+        </w:rPr>
+        <w:t xml:space="preserve"/>
+      </w:r>
+      <w:r>
+        <w:rPr>
+          <w:b/>
+          <w:bCs/>
+          <w:lang w:val="en-US"/>
+        </w:rPr>
+        <w:t xml:space="preserve"/>
+      </w:r>
+      <w:r>
+        <w:rPr>
+          <w:lang w:val="en-US"/>
+        </w:rPr>
+        <w:t xml:space="preserve"/>
+      </w:r>
+      <w:r>
+        <w:rPr>
+          <w:lang w:val="en-US"/>
+        </w:rPr>
+        <w:t xml:space="preserve"> </w:t>
       </w:r>
       <w:r>
         <w:rPr>
@@ -14956,7 +14956,7 @@
         <w:rPr>
           <w:lang w:val="en-US"/>
         </w:rPr>
-        <w:t xml:space="preserve"> used published 14-day mass-loss measurements obtained from revised simulated body fluid (r-SBF) immersion experiments reported by Liu et al. </w:t>
+        <w:t xml:space="preserve"> used published 14-day mass-loss measurements obtained from revised simulated body fluid (r-SBF) immersion experiments reported by Liu et al. [54] (Section S5).</w:t>
       </w:r>
       <w:r>
         <w:rPr>
@@ -14984,7 +14984,7 @@
           <w:rFonts w:cs="Times New Roman"/>
           <w:vertAlign w:val="superscript"/>
         </w:rPr>
-        <w:t>[54]</w:t>
+        <w:t xml:space="preserve"/>
       </w:r>
       <w:r>
         <w:rPr>
@@ -14998,38 +14998,38 @@
           <w:rFonts w:cs="Times New Roman"/>
           <w:lang w:val="en-US"/>
         </w:rPr>
-        <w:t xml:space="preserve"> (</w:t>
-      </w:r>
-      <w:r>
-        <w:rPr>
-          <w:rFonts w:cs="Times New Roman"/>
-          <w:b/>
-          <w:bCs/>
-          <w:lang w:val="en-US"/>
-        </w:rPr>
-        <w:t>Table S</w:t>
-      </w:r>
-      <w:r>
-        <w:rPr>
-          <w:rFonts w:cs="Times New Roman"/>
-          <w:b/>
-          <w:bCs/>
-          <w:lang w:val="en-US"/>
-        </w:rPr>
-        <w:t>7</w:t>
-      </w:r>
-      <w:r>
-        <w:rPr>
-          <w:rFonts w:cs="Times New Roman"/>
-          <w:lang w:val="en-US"/>
-        </w:rPr>
-        <w:t>)</w:t>
-      </w:r>
-      <w:r>
-        <w:rPr>
-          <w:lang w:val="en-US"/>
-        </w:rPr>
-        <w:t xml:space="preserve">. Optimal parameter combinations were identified by minimizing the RMSE between simulated and literature mass-loss data. </w:t>
+        <w:t xml:space="preserve"/>
+      </w:r>
+      <w:r>
+        <w:rPr>
+          <w:rFonts w:cs="Times New Roman"/>
+          <w:b/>
+          <w:bCs/>
+          <w:lang w:val="en-US"/>
+        </w:rPr>
+        <w:t xml:space="preserve"/>
+      </w:r>
+      <w:r>
+        <w:rPr>
+          <w:rFonts w:cs="Times New Roman"/>
+          <w:b/>
+          <w:bCs/>
+          <w:lang w:val="en-US"/>
+        </w:rPr>
+        <w:t xml:space="preserve"/>
+      </w:r>
+      <w:r>
+        <w:rPr>
+          <w:rFonts w:cs="Times New Roman"/>
+          <w:lang w:val="en-US"/>
+        </w:rPr>
+        <w:t xml:space="preserve"/>
+      </w:r>
+      <w:r>
+        <w:rPr>
+          <w:lang w:val="en-US"/>
+        </w:rPr>
+        <w:t xml:space="preserve"> Optimal parameter combinations were identified by minimizing the RMSE between simulated and literature mass-loss data. </w:t>
       </w:r>
       <w:r>
         <w:rPr>
@@ -16733,7 +16733,7 @@
         <w:rPr>
           <w:lang w:val="en-US"/>
         </w:rPr>
-        <w:t xml:space="preserve">2% against the calibration dataset. These results show that the proposed three-parameter framework can closely reproduce the calibration measurements. The combination of low calibration error and rapid convergence supports the framework’s potential </w:t>
+        <w:t xml:space="preserve">2% against the calibration dataset. These results show that the proposed three-parameter framework can closely reproduce the calibration measurements (Sections S5 and S6). The combination of low calibration error and rapid convergence supports the framework’s potential </w:t>
       </w:r>
       <w:r>
         <w:rPr>
@@ -22206,32 +22206,32 @@
           <w:rFonts w:cs="Times New Roman"/>
           <w:lang w:val="en-US"/>
         </w:rPr>
-        <w:t xml:space="preserve"> (</w:t>
-      </w:r>
-      <w:r>
-        <w:rPr>
-          <w:rFonts w:cs="Times New Roman"/>
-          <w:b/>
-          <w:bCs/>
-          <w:lang w:val="en-US"/>
-        </w:rPr>
-        <w:t>Table S</w:t>
-      </w:r>
-      <w:r>
-        <w:rPr>
-          <w:rFonts w:cs="Times New Roman"/>
-          <w:b/>
-          <w:bCs/>
-          <w:lang w:val="en-US"/>
-        </w:rPr>
-        <w:t>8</w:t>
-      </w:r>
-      <w:r>
-        <w:rPr>
-          <w:rFonts w:cs="Times New Roman"/>
-          <w:lang w:val="en-US"/>
-        </w:rPr>
-        <w:t>)</w:t>
+        <w:t xml:space="preserve"> (Section S5)</w:t>
+      </w:r>
+      <w:r>
+        <w:rPr>
+          <w:rFonts w:cs="Times New Roman"/>
+          <w:b/>
+          <w:bCs/>
+          <w:lang w:val="en-US"/>
+        </w:rPr>
+        <w:t xml:space="preserve"/>
+      </w:r>
+      <w:r>
+        <w:rPr>
+          <w:rFonts w:cs="Times New Roman"/>
+          <w:b/>
+          <w:bCs/>
+          <w:lang w:val="en-US"/>
+        </w:rPr>
+        <w:t xml:space="preserve"/>
+      </w:r>
+      <w:r>
+        <w:rPr>
+          <w:rFonts w:cs="Times New Roman"/>
+          <w:lang w:val="en-US"/>
+        </w:rPr>
+        <w:t xml:space="preserve"/>
       </w:r>
       <w:r>
         <w:rPr>
@@ -22650,21 +22650,21 @@
         <w:rPr>
           <w:lang w:val="en-US"/>
         </w:rPr>
-        <w:t>, indicating a very strong correlation between the two variables (</w:t>
-      </w:r>
-      <w:r>
-        <w:rPr>
-          <w:b/>
-          <w:bCs/>
-          <w:lang w:val="en-US"/>
-        </w:rPr>
-        <w:t>Figure S9</w:t>
-      </w:r>
-      <w:r>
-        <w:rPr>
-          <w:lang w:val="en-US"/>
-        </w:rPr>
-        <w:t>).</w:t>
+        <w:t xml:space="preserve">, indicating a very strong correlation between the two variables (Section S7).</w:t>
+      </w:r>
+      <w:r>
+        <w:rPr>
+          <w:b/>
+          <w:bCs/>
+          <w:lang w:val="en-US"/>
+        </w:rPr>
+        <w:t xml:space="preserve"/>
+      </w:r>
+      <w:r>
+        <w:rPr>
+          <w:lang w:val="en-US"/>
+        </w:rPr>
+        <w:t xml:space="preserve"/>
       </w:r>
       <w:r>
         <w:rPr>
@@ -23149,13 +23149,13 @@
         <w:rPr>
           <w:lang w:val="en-US"/>
         </w:rPr>
-        <w:t>Because no spatial variation in corrosion kinetics was prescribed, this heterogeneous degradation arose from the coupled effects of geometry, oxygen transport, corrosion-product accumulation, and interface recession. Oxygen availability remained higher along the outward-facing crown surfaces, which were exposed to the surrounding electrolyte and supplied from multiple directions, whereas transport to the inner-curvature regions was progressively restricted by geometric confinement and corrosion-product accumulation</w:t>
-      </w:r>
-      <w:r>
-        <w:rPr>
-          <w:lang w:val="en-US"/>
-        </w:rPr>
-        <w:t xml:space="preserve"> (</w:t>
+        <w:t xml:space="preserve">Because no spatial variation in corrosion kinetics was prescribed, this heterogeneous degradation arose from the coupled effects of geometry, oxygen transport, corrosion-product accumulation, and interface recession. Oxygen availability remained higher along the outward-facing crown surfaces, which were exposed to the surrounding electrolyte and supplied from multiple directions, whereas transport to the inner-curvature regions was progressively restricted by geometric confinement and corrosion-product accumulation (Figure 7b; Section S7).</w:t>
+      </w:r>
+      <w:r>
+        <w:rPr>
+          <w:lang w:val="en-US"/>
+        </w:rPr>
+        <w:t xml:space="preserve"/>
       </w:r>
       <w:r>
         <w:rPr>
@@ -23194,7 +23194,7 @@
           <w:bCs/>
           <w:lang w:val="en-US"/>
         </w:rPr>
-        <w:t>Figure 7</w:t>
+        <w:t xml:space="preserve"/>
       </w:r>
       <w:r>
         <w:rPr>
@@ -23210,13 +23210,13 @@
           <w:bCs/>
           <w:lang w:val="en-US"/>
         </w:rPr>
-        <w:t>b)</w:t>
-      </w:r>
-      <w:r>
-        <w:rPr>
-          <w:lang w:val="en-US"/>
-        </w:rPr>
-        <w:t xml:space="preserve">. </w:t>
+        <w:t xml:space="preserve"/>
+      </w:r>
+      <w:r>
+        <w:rPr>
+          <w:lang w:val="en-US"/>
+        </w:rPr>
+        <w:t xml:space="preserve"> </w:t>
       </w:r>
       <w:r>
         <w:rPr>
@@ -23787,7 +23787,7 @@
         <w:rPr>
           <w:lang w:val="en-US"/>
         </w:rPr>
-        <w:t>Following the stent-scale analysis, the role of individual geometric features was further isolated using simplified wire configurations. Curvature produced only modest differences in cumulative mass loss, although mass loss increased progressively with arc angle and was highest for the 150° arc</w:t>
+        <w:t xml:space="preserve">Following the stent-scale analysis, the role of individual geometric features was further isolated using simplified wire configurations (Section S7). Curvature produced only modest differences in cumulative mass loss, although mass loss increased progressively with arc angle and was highest for the 150° arc</w:t>
       </w:r>
       <w:r>
         <w:rPr>
@@ -24432,7 +24432,50 @@
         <w:rPr>
           <w:lang w:val="en-US"/>
         </w:rPr>
-        <w:t>Future developments should incorporate physiologically realistic flow conditions, additional ionic species, multiphase corrosion-product evolution, and spatially heterogeneous electrochemical activity. Extending the framework to Zn alloys will also require accounting for alloying elements, secondary phases, and galvanic interactions. Although the current physics-based simulations remain computationally demanding, the reduced calibrated parameter space and the geometric and field data stored at each time step provide a strong basis for training surrogate models. Once trained, these models could rapidly predict the temporal evolution of mass loss, local penetration, species distributions, and degradation morphology, enabling efficient exploration of large implant-design spaces. Coupling these predictions with mechanical analysis would further link geometry-dependent degradation to strut thinning, stress concentration, topological change, and loss of structural integrity. With appropriate experimental calibration and validation, the framework could consequently be extended from stents to porous scaffolds, fixation devices, and other architected biodegradable implants as an efficient platform for degradation-informed design.</w:t>
+        <w:t xml:space="preserve">Future developments should incorporate physiologically realistic flow conditions, additional ionic species, multiphase corrosion-product evolution, and spatially heterogeneous electrochemical activity. Extending the framework to Zn alloys will also require accounting for alloying elements, secondary phases, and galvanic interactions. Although the current physics-based simulations remain computationally demanding, the reduced calibrated parameter space, which enabled the sensitivity, calibration and uncertainty analyses (Sections S4–S6), and the geometric and field data stored at each time step provide a strong basis for training surrogate models</w:t>
+      </w:r>
+      <w:r>
+        <w:rPr>
+          <w:lang w:val="en-US"/>
+        </w:rPr>
+        <w:t xml:space="preserve"> </w:t>
+      </w:r>
+      <w:r>
+        <w:rPr>
+          <w:lang w:val="en-US"/>
+        </w:rPr>
+        <w:fldChar w:fldCharType="begin"/>
+      </w:r>
+      <w:r>
+        <w:rPr>
+          <w:lang w:val="en-US"/>
+        </w:rPr>
+        <w:instrText xml:space="preserve"> ADDIN ZOTERO_ITEM CSL_CITATION {"citationID":"bMB1q7VU","properties":{"unsorted":false,"formattedCitation":"\\super [35]\\nosupersub{}","plainCitation":"[35]","noteIndex":0},"citationItems":[{"id":4470,"uris":["http://zotero.org/users/16939557/items/WJC43EWN"],"itemData":{"id":4470,"type":"article-journal","abstract":"Abstract\n            Computational models of electrochemical biodegradation of magnesium (Mg)‐based implants are uncertain. To quantify the model uncertainty, iterative evaluations are needed. This presents a challenge, especially for complex, multiscale models as is the case here. Approximating high‐cost and complex models with easy‐to‐evaluate surrogate models can reduce the computational burden. However, the application of this approach to complex degradation models remains limited and understudied. This work provides a workflow to quantify different types of uncertainty within biodegradation models. Three surrogate models—Kriging, polynomial chaos expansion, and polynomial chaos Kriging—are compared based on the minimum number of samples required for surrogate model construction, surrogate model accuracy, and computational time. The surrogate models are tested for three computational models representing Mg‐based implant biodegradation. Global sensitivity analysis and uncertainty propagation are used to analyze the uncertainties associated with the different models. The findings indicate that Kriging proves effective for calibrating diverse computational models with minimal computational time and cost, while polynomial chaos expansion and polynomial chaos Kriging exhibit greater capability in predicting propagated uncertainties within the computational models.","citation-key":"albaraghthehBestPracticesDeveloping2024","container-title":"Advanced Science","DOI":"10.1002/advs.202403543","ISSN":"2198-3844, 2198-3844","issue":"46","journalAbbreviation":"Advanced Science","language":"en","page":"2403543","source":"DOI.org (Crossref)","title":"Best Practices in Developing a Workflow for Uncertainty Quantification for Modeling the Biodegradation of Mg‐Based Implants","volume":"11","author":[{"family":"AlBaraghtheh","given":"Tamadur"},{"family":"Willumeit‐Römer","given":"Regine"},{"family":"Zeller‐Plumhoff","given":"Berit"}],"issued":{"date-parts":[["2024",12]]}}}],"schema":"https://github.com/citation-style-language/schema/raw/master/csl-citation.json"} </w:instrText>
+      </w:r>
+      <w:r>
+        <w:rPr>
+          <w:lang w:val="en-US"/>
+        </w:rPr>
+        <w:fldChar w:fldCharType="separate"/>
+      </w:r>
+      <w:r>
+        <w:rPr>
+          <w:rFonts w:cs="Times New Roman"/>
+          <w:vertAlign w:val="superscript"/>
+        </w:rPr>
+        <w:t>[35]</w:t>
+      </w:r>
+      <w:r>
+        <w:rPr>
+          <w:lang w:val="en-US"/>
+        </w:rPr>
+        <w:fldChar w:fldCharType="end"/>
+      </w:r>
+      <w:r>
+        <w:rPr>
+          <w:lang w:val="en-US"/>
+        </w:rPr>
+        <w:t xml:space="preserve">. Once trained, these models could rapidly predict the temporal evolution of mass loss, local penetration, species distributions, and degradation morphology, enabling efficient exploration of large implant-design spaces. Coupling these predictions with mechanical analysis would further link geometry-dependent degradation to strut thinning, stress concentration, topological change, and loss of structural integrity. With appropriate experimental calibration and validation, the framework could consequently be extended from stents to porous scaffolds, fixation devices, and other architected biodegradable implants as an efficient platform for degradation-informed design.</w:t>
       </w:r>
     </w:p>
     <w:p>

</xml_diff>

<commit_message>
Manuscript: calibration cites Section S5; restore Table S8 and Figure S9 citations
Co-Authored-By: Claude Sonnet 5.5 <noreply@anthropic.com>
Claude-Session: https://claude.ai/code/session_01Y1g9vByMLTE8eGJ9K81zt6
</commit_message>
<xml_diff>
--- a/Manuscript_AS_formatted.docx
+++ b/Manuscript_AS_formatted.docx
@@ -16733,7 +16733,7 @@
         <w:rPr>
           <w:lang w:val="en-US"/>
         </w:rPr>
-        <w:t xml:space="preserve">2% against the calibration dataset. These results show that the proposed three-parameter framework can closely reproduce the calibration measurements (Sections S5 and S6). The combination of low calibration error and rapid convergence supports the framework’s potential </w:t>
+        <w:t xml:space="preserve">2% against the calibration dataset. These results show that the proposed three-parameter framework can closely reproduce the calibration measurements (Section S5). The combination of low calibration error and rapid convergence supports the framework’s potential </w:t>
       </w:r>
       <w:r>
         <w:rPr>
@@ -22650,7 +22650,7 @@
         <w:rPr>
           <w:lang w:val="en-US"/>
         </w:rPr>
-        <w:t xml:space="preserve">, indicating a very strong correlation between the two variables (Section S7).</w:t>
+        <w:t xml:space="preserve">, indicating a very strong correlation between the two variables (Figure S9).</w:t>
       </w:r>
       <w:r>
         <w:rPr>

</xml_diff>

<commit_message>
Manuscript: rewrite Conclusions, add optimization outlook paragraph and refs 57-58
Co-Authored-By: Claude Sonnet 5.5 <noreply@anthropic.com>
Claude-Session: https://claude.ai/code/session_01Y1g9vByMLTE8eGJ9K81zt6
</commit_message>
<xml_diff>
--- a/Manuscript_AS_formatted.docx
+++ b/Manuscript_AS_formatted.docx
@@ -24481,6 +24481,20 @@
     <w:p>
       <w:pPr>
         <w:pStyle w:val="BodyText"/>
+        <w:rPr>
+          <w:lang w:val="en-US"/>
+        </w:rPr>
+      </w:pPr>
+      <w:r>
+        <w:rPr>
+          <w:lang w:val="en-US"/>
+        </w:rPr>
+        <w:t xml:space="preserve">Structural optimization of biomedical implants, from patient-specific bone replacements to porous scaffolds, has so far targeted mechanical performance in the as-fabricated state [57,58]. For biodegradable implants this is insufficient, because geometry, transport, and degradation are coupled: degradation reshapes the structure that carries load, so mechanical properties evolve with time. By resolving how geometry controls local oxygen availability and recession, the present formulation supplies the degradation component that such optimization currently lacks.</w:t>
+      </w:r>
+    </w:p>
+    <w:p>
+      <w:pPr>
+        <w:pStyle w:val="BodyText"/>
         <w:ind w:firstLine="0"/>
         <w:rPr>
           <w:lang w:val="en-US"/>
@@ -24508,89 +24522,10 @@
         <w:rPr>
           <w:lang w:val="en-US"/>
         </w:rPr>
-        <w:t xml:space="preserve">This study establishes that Zn biodegradation under physiological conditions </w:t>
-      </w:r>
-      <w:r>
-        <w:rPr>
-          <w:lang w:val="en-US"/>
-        </w:rPr>
-        <w:t>follows</w:t>
-      </w:r>
-      <w:r>
-        <w:rPr>
-          <w:lang w:val="en-US"/>
-        </w:rPr>
-        <w:t xml:space="preserve"> a self-limiting, oxygen-transport-controlled mechanism. The developed </w:t>
-      </w:r>
-      <w:r>
-        <w:rPr>
-          <w:lang w:val="en-US"/>
-        </w:rPr>
-        <w:t>3D</w:t>
-      </w:r>
-      <w:r>
-        <w:rPr>
-          <w:lang w:val="en-US"/>
-        </w:rPr>
-        <w:t xml:space="preserve"> reaction-diffusion framework </w:t>
+        <w:t xml:space="preserve">This study shows that Zn biodegradation under physiological conditions is a self-limiting, oxygen-transport-controlled process, and that implant geometry determines both how fast and where material is lost. A 3D reaction-diffusion framework with only three calibrated kinetic parameters reproduced the independent 28-day mass-loss response with an RMSE of 0.0159%. Sensitivity and mechanistic analyses identified oxygen availability as the dominant control: corrosion-product accumulation progressively restricts oxygen transport, shifting degradation from reaction-controlled to diffusion-controlled behavior. Most importantly, geometry-dependent degradation emerged from this transport physics alone, without any prescribed spatial variation in corrosion kinetics. The disc-calibrated parameters transferred to a six-crown stent without geometry-specific recalibration, predicting approximately 6% mass loss after 672 h and pronounced localization at oxygen-accessible crown surfaces, while simplified wires showed that curvature and inter-strut spacing modestly change cumulative mass loss but strongly control where material is lost. Cumulative mass loss and nominal corrosion rate alone can therefore conceal the localized recession that governs strut thinning and structural failure. Geometry is thus a decisive design variable for degradation, and the proposed framework establishes a foundation for degradation-aware structural optimization of biodegradable implants, particularly Zn stents.</w:t>
       </w:r>
       <w:proofErr w:type="gramStart"/>
-      <w:r>
-        <w:rPr>
-          <w:lang w:val="en-US"/>
-        </w:rPr>
-        <w:t>couples</w:t>
-      </w:r>
       <w:proofErr w:type="gramEnd"/>
-      <w:r>
-        <w:rPr>
-          <w:lang w:val="en-US"/>
-        </w:rPr>
-        <w:t xml:space="preserve"> anodic dissolution, cathodic oxygen reduction, species transport, corrosion-product evolution, and interface recession. Sensitivity and mechanistic analyses identified oxygen availability as the dominant control on mass loss and showed that corrosion-product accumulation progressively restricts oxygen transport, shifting degradation from reaction-controlled to diffusion-controlled behavior. With only three calibrated kinetic parameters, the model reproduced the 28-day experimental mass-loss response with an RMSE of 0.0159%.</w:t>
-      </w:r>
-      <w:r>
-        <w:rPr>
-          <w:lang w:val="en-US"/>
-        </w:rPr>
-        <w:t xml:space="preserve"> </w:t>
-      </w:r>
-      <w:r>
-        <w:rPr>
-          <w:lang w:val="en-US"/>
-        </w:rPr>
-        <w:t xml:space="preserve">Most importantly, geometry-dependent degradation emerged without prescribing spatial variations in corrosion kinetics. The disc-calibrated parameters transferred to a six-crown stent without geometry-specific recalibration, predicting approximately 6% mass loss after </w:t>
-      </w:r>
-      <w:r>
-        <w:rPr>
-          <w:lang w:val="en-US"/>
-        </w:rPr>
-        <w:t>672</w:t>
-      </w:r>
-      <w:r>
-        <w:rPr>
-          <w:lang w:val="en-US"/>
-        </w:rPr>
-        <w:t xml:space="preserve"> h and revealing pronounced localization at oxygen-accessible crown surfaces. Simplified geometry studies further showed that curvature and inter-strut spacing have relatively modest effects on mean degradation but strongly control where material loss occurs. </w:t>
-      </w:r>
-      <w:r>
-        <w:rPr>
-          <w:lang w:val="en-US"/>
-        </w:rPr>
-        <w:t>Therefore</w:t>
-      </w:r>
-      <w:r>
-        <w:rPr>
-          <w:lang w:val="en-US"/>
-        </w:rPr>
-        <w:t xml:space="preserve">, cumulative mass loss and nominal corrosion rate alone may conceal localized recession relevant to strut thinning </w:t>
-      </w:r>
-      <w:r>
-        <w:rPr>
-          <w:lang w:val="en-US"/>
-        </w:rPr>
-        <w:lastRenderedPageBreak/>
-        <w:t>and structural failure. By linking implant geometry to both the rate and spatial evolution of degradation through the underlying transport physics, this framework provides a mechanistic and computationally tractable foundation for degradation-informed design of stents, scaffolds, lattices, and other biodegradable Zn implants. Its reduced parameter space and time-resolved field outputs also create a basis for surrogate-model training and future coupling with mechanical-integrity simulations.</w:t>
-      </w:r>
       <w:bookmarkEnd w:id="24"/>
     </w:p>
     <w:p>
@@ -26667,6 +26602,62 @@
       </w:r>
       <w:r>
         <w:t xml:space="preserve"> (2019): 87–96, https://doi.org/10.1016/j.bioactmat.2018.08.003.</w:t>
+      </w:r>
+    </w:p>
+    <w:p>
+      <w:pPr>
+        <w:pStyle w:val="Bibliography"/>
+      </w:pPr>
+      <w:r>
+        <w:t xml:space="preserve">57. A. Sutradhar, G. H. Paulino, M. J. Miller, and T. H. Nguyen, “Topological Optimization for Designing Patient-Specific Large Craniofacial Segmental Bone Replacements,” </w:t>
+      </w:r>
+      <w:r>
+        <w:rPr>
+          <w:i/>
+          <w:iCs/>
+        </w:rPr>
+        <w:t xml:space="preserve">Proceedings of the National Academy of Sciences</w:t>
+      </w:r>
+      <w:r>
+        <w:t xml:space="preserve"> </w:t>
+      </w:r>
+      <w:r>
+        <w:rPr>
+          <w:i/>
+          <w:iCs/>
+        </w:rPr>
+        <w:t xml:space="preserve">107</w:t>
+      </w:r>
+      <w:r>
+        <w:t xml:space="preserve">, no. 30 (2010): 13222–13227, https://doi.org/10.1073/pnas.1001208107.</w:t>
+      </w:r>
+    </w:p>
+    <w:p>
+      <w:pPr>
+        <w:pStyle w:val="Bibliography"/>
+      </w:pPr>
+      <w:r>
+        <w:t xml:space="preserve">58. S. J. Hollister, “Porous Scaffold Design for Tissue Engineering,” </w:t>
+      </w:r>
+      <w:r>
+        <w:rPr>
+          <w:i/>
+          <w:iCs/>
+        </w:rPr>
+        <w:t xml:space="preserve">Nature Materials</w:t>
+      </w:r>
+      <w:r>
+        <w:t xml:space="preserve"> </w:t>
+      </w:r>
+      <w:r>
+        <w:rPr>
+          <w:i/>
+          <w:iCs/>
+        </w:rPr>
+        <w:t xml:space="preserve">4</w:t>
+      </w:r>
+      <w:r>
+        <w:t xml:space="preserve">, no. 7 (2005): 518–524, https://doi.org/10.1038/nmat1421.</w:t>
       </w:r>
     </w:p>
     <w:p>

</xml_diff>

<commit_message>
Move Figure 2 schematic to Methods; renumber figures, update SI and workbook references
Co-Authored-By: Claude Sonnet 5.5 <noreply@anthropic.com>
Claude-Session: https://claude.ai/code/session_01Y1g9vByMLTE8eGJ9K81zt6
</commit_message>
<xml_diff>
--- a/Manuscript_AS_formatted.docx
+++ b/Manuscript_AS_formatted.docx
@@ -1765,11 +1765,10 @@
         <w:rPr>
           <w:lang w:val="en-US"/>
         </w:rPr>
-        <w:t xml:space="preserve">The coupled mechanistic framework is shown schematically in </w:t>
-      </w:r>
-      <w:r>
-        <w:rPr>
-          <w:rFonts w:cs="Times New Roman"/>
+        <w:t xml:space="preserve">The model parameters are summarized in </w:t>
+      </w:r>
+      <w:r>
+        <w:rPr>
           <w:b/>
           <w:bCs/>
           <w:lang w:val="en-US"/>
@@ -1778,24 +1777,21 @@
       </w:r>
       <w:r>
         <w:rPr>
-          <w:rFonts w:cs="Times New Roman"/>
-          <w:b/>
-          <w:bCs/>
-          <w:lang w:val="en-US"/>
-        </w:rPr>
-        <w:instrText xml:space="preserve"> REF _Ref238652979 \h  \* MERGEFORMAT </w:instrText>
-      </w:r>
-      <w:r>
-        <w:rPr>
-          <w:rFonts w:cs="Times New Roman"/>
-          <w:b/>
-          <w:bCs/>
-          <w:lang w:val="en-US"/>
-        </w:rPr>
-      </w:r>
-      <w:r>
-        <w:rPr>
-          <w:rFonts w:cs="Times New Roman"/>
+          <w:b/>
+          <w:bCs/>
+          <w:lang w:val="en-US"/>
+        </w:rPr>
+        <w:instrText xml:space="preserve"> REF _Ref238635735 \h  \* MERGEFORMAT </w:instrText>
+      </w:r>
+      <w:r>
+        <w:rPr>
+          <w:b/>
+          <w:bCs/>
+          <w:lang w:val="en-US"/>
+        </w:rPr>
+      </w:r>
+      <w:r>
+        <w:rPr>
           <w:b/>
           <w:bCs/>
           <w:lang w:val="en-US"/>
@@ -1808,11 +1804,19 @@
           <w:bCs/>
           <w:lang w:val="en-US"/>
         </w:rPr>
-        <w:t>Figure 2</w:t>
-      </w:r>
-      <w:r>
-        <w:rPr>
-          <w:rFonts w:cs="Times New Roman"/>
+        <w:t xml:space="preserve">Table </w:t>
+      </w:r>
+      <w:r>
+        <w:rPr>
+          <w:b/>
+          <w:bCs/>
+          <w:noProof/>
+          <w:lang w:val="en-US"/>
+        </w:rPr>
+        <w:t>1</w:t>
+      </w:r>
+      <w:r>
+        <w:rPr>
           <w:b/>
           <w:bCs/>
           <w:lang w:val="en-US"/>
@@ -1823,251 +1827,8 @@
         <w:rPr>
           <w:lang w:val="en-US"/>
         </w:rPr>
-        <w:t xml:space="preserve"> and its parameters are summarized in </w:t>
-      </w:r>
-      <w:r>
-        <w:rPr>
-          <w:b/>
-          <w:bCs/>
-          <w:lang w:val="en-US"/>
-        </w:rPr>
-        <w:fldChar w:fldCharType="begin"/>
-      </w:r>
-      <w:r>
-        <w:rPr>
-          <w:b/>
-          <w:bCs/>
-          <w:lang w:val="en-US"/>
-        </w:rPr>
-        <w:instrText xml:space="preserve"> REF _Ref238635735 \h  \* MERGEFORMAT </w:instrText>
-      </w:r>
-      <w:r>
-        <w:rPr>
-          <w:b/>
-          <w:bCs/>
-          <w:lang w:val="en-US"/>
-        </w:rPr>
-      </w:r>
-      <w:r>
-        <w:rPr>
-          <w:b/>
-          <w:bCs/>
-          <w:lang w:val="en-US"/>
-        </w:rPr>
-        <w:fldChar w:fldCharType="separate"/>
-      </w:r>
-      <w:r>
-        <w:rPr>
-          <w:b/>
-          <w:bCs/>
-          <w:lang w:val="en-US"/>
-        </w:rPr>
-        <w:t xml:space="preserve">Table </w:t>
-      </w:r>
-      <w:r>
-        <w:rPr>
-          <w:b/>
-          <w:bCs/>
-          <w:noProof/>
-          <w:lang w:val="en-US"/>
-        </w:rPr>
-        <w:t>1</w:t>
-      </w:r>
-      <w:r>
-        <w:rPr>
-          <w:b/>
-          <w:bCs/>
-          <w:lang w:val="en-US"/>
-        </w:rPr>
-        <w:fldChar w:fldCharType="end"/>
-      </w:r>
-      <w:r>
-        <w:rPr>
-          <w:lang w:val="en-US"/>
-        </w:rPr>
         <w:t xml:space="preserve">; the experimental procedure, model formulation, numerical implementation, and calibration are described in the Methods.</w:t>
       </w:r>
-    </w:p>
-    <w:p>
-      <w:pPr>
-        <w:pStyle w:val="CaptionedFigure"/>
-        <w:keepNext/>
-        <w:ind w:firstLine="0"/>
-        <w:jc w:val="center"/>
-        <w:rPr>
-          <w:lang w:val="en-US"/>
-        </w:rPr>
-      </w:pPr>
-      <w:bookmarkStart w:id="4" w:name="fig:chemistry"/>
-      <w:bookmarkEnd w:id="3"/>
-      <w:r>
-        <w:rPr>
-          <w:noProof/>
-          <w:lang w:val="en-US"/>
-        </w:rPr>
-        <w:drawing>
-          <wp:inline distT="0" distB="0" distL="0" distR="0" wp14:anchorId="6B2B0989" wp14:editId="2B16D036">
-            <wp:extent cx="5760720" cy="4340225"/>
-            <wp:effectExtent l="0" t="0" r="0" b="3175"/>
-            <wp:docPr id="10" name="Picture 10"/>
-            <wp:cNvGraphicFramePr>
-              <a:graphicFrameLocks xmlns:a="http://schemas.openxmlformats.org/drawingml/2006/main" noChangeAspect="1"/>
-            </wp:cNvGraphicFramePr>
-            <a:graphic xmlns:a="http://schemas.openxmlformats.org/drawingml/2006/main">
-              <a:graphicData uri="http://schemas.openxmlformats.org/drawingml/2006/picture">
-                <pic:pic xmlns:pic="http://schemas.openxmlformats.org/drawingml/2006/picture">
-                  <pic:nvPicPr>
-                    <pic:cNvPr id="10" name="Picture 10"/>
-                    <pic:cNvPicPr/>
-                  </pic:nvPicPr>
-                  <pic:blipFill>
-                    <a:blip r:embed="rId16" cstate="print">
-                      <a:extLst>
-                        <a:ext uri="{28A0092B-C50C-407E-A947-70E740481C1C}">
-                          <a14:useLocalDpi xmlns:a14="http://schemas.microsoft.com/office/drawing/2010/main" val="0"/>
-                        </a:ext>
-                      </a:extLst>
-                    </a:blip>
-                    <a:stretch>
-                      <a:fillRect/>
-                    </a:stretch>
-                  </pic:blipFill>
-                  <pic:spPr>
-                    <a:xfrm>
-                      <a:off x="0" y="0"/>
-                      <a:ext cx="5760720" cy="4340225"/>
-                    </a:xfrm>
-                    <a:prstGeom prst="rect">
-                      <a:avLst/>
-                    </a:prstGeom>
-                  </pic:spPr>
-                </pic:pic>
-              </a:graphicData>
-            </a:graphic>
-          </wp:inline>
-        </w:drawing>
-      </w:r>
-    </w:p>
-    <w:p>
-      <w:pPr>
-        <w:pStyle w:val="Captions"/>
-        <w:rPr>
-          <w:lang w:val="en-US"/>
-        </w:rPr>
-      </w:pPr>
-      <w:bookmarkStart w:id="5" w:name="_Ref238652979"/>
-      <w:r>
-        <w:rPr>
-          <w:b/>
-          <w:bCs/>
-          <w:lang w:val="en-US"/>
-        </w:rPr>
-        <w:t>Fig</w:t>
-      </w:r>
-      <w:r>
-        <w:rPr>
-          <w:b/>
-          <w:bCs/>
-          <w:lang w:val="en-US"/>
-        </w:rPr>
-        <w:t>ure</w:t>
-      </w:r>
-      <w:r>
-        <w:rPr>
-          <w:b/>
-          <w:bCs/>
-          <w:lang w:val="en-US"/>
-        </w:rPr>
-        <w:t xml:space="preserve"> </w:t>
-      </w:r>
-      <w:r>
-        <w:rPr>
-          <w:b/>
-          <w:bCs/>
-          <w:lang w:val="en-US"/>
-        </w:rPr>
-        <w:fldChar w:fldCharType="begin"/>
-      </w:r>
-      <w:r>
-        <w:rPr>
-          <w:b/>
-          <w:bCs/>
-          <w:lang w:val="en-US"/>
-        </w:rPr>
-        <w:instrText xml:space="preserve"> SEQ Fig._ \* ARABIC </w:instrText>
-      </w:r>
-      <w:r>
-        <w:rPr>
-          <w:b/>
-          <w:bCs/>
-          <w:lang w:val="en-US"/>
-        </w:rPr>
-        <w:fldChar w:fldCharType="separate"/>
-      </w:r>
-      <w:r>
-        <w:rPr>
-          <w:b/>
-          <w:bCs/>
-          <w:noProof/>
-          <w:lang w:val="en-US"/>
-        </w:rPr>
-        <w:t>2</w:t>
-      </w:r>
-      <w:r>
-        <w:rPr>
-          <w:b/>
-          <w:bCs/>
-          <w:lang w:val="en-US"/>
-        </w:rPr>
-        <w:fldChar w:fldCharType="end"/>
-      </w:r>
-      <w:bookmarkEnd w:id="5"/>
-      <w:r>
-        <w:rPr>
-          <w:b/>
-          <w:bCs/>
-          <w:lang w:val="en-US"/>
-        </w:rPr>
-        <w:t>.</w:t>
-      </w:r>
-      <w:r>
-        <w:rPr>
-          <w:lang w:val="en-US"/>
-        </w:rPr>
-        <w:t xml:space="preserve"> </w:t>
-      </w:r>
-      <w:r>
-        <w:rPr>
-          <w:lang w:val="en-US"/>
-        </w:rPr>
-        <w:t>Schematic of the coupled mechanistic framework for Zn biodegradation in physiological media. (a) Electrochemical reactions governing Zn dissolution, oxygen reduction, film formation, and chloride-induced film breakdown, (</w:t>
-      </w:r>
-      <w:r>
-        <w:rPr>
-          <w:lang w:val="en-US"/>
-        </w:rPr>
-        <w:t>b</w:t>
-      </w:r>
-      <w:r>
-        <w:rPr>
-          <w:lang w:val="en-US"/>
-        </w:rPr>
-        <w:t>) porous corrosion-product film structure showing the influence of porosity and tortuosity on effective species diffusion</w:t>
-      </w:r>
-      <w:r>
-        <w:rPr>
-          <w:lang w:val="en-US"/>
-        </w:rPr>
-        <w:t>, (c) level-set tracking of the moving metal-electrolyte interface and associated species transport.</w:t>
-      </w:r>
-    </w:p>
-    <w:p>
-      <w:pPr>
-        <w:pStyle w:val="Captions"/>
-        <w:rPr>
-          <w:lang w:val="en-US"/>
-        </w:rPr>
-      </w:pPr>
     </w:p>
     <w:p>
       <w:pPr>
@@ -6220,7 +5981,7 @@
           <w:bCs/>
           <w:lang w:val="en-US"/>
         </w:rPr>
-        <w:t>Figure 3</w:t>
+        <w:t>Figure 2</w:t>
       </w:r>
       <w:r>
         <w:rPr>
@@ -7152,7 +6913,7 @@
           <w:bCs/>
           <w:lang w:val="en-US"/>
         </w:rPr>
-        <w:t>Figure 3</w:t>
+        <w:t>Figure 2</w:t>
       </w:r>
       <w:r>
         <w:rPr>
@@ -7434,7 +7195,7 @@
           <w:noProof/>
           <w:lang w:val="en-US"/>
         </w:rPr>
-        <w:t>3</w:t>
+        <w:t>2</w:t>
       </w:r>
       <w:r>
         <w:rPr>
@@ -8670,7 +8431,7 @@
           <w:bCs/>
           <w:lang w:val="en-US"/>
         </w:rPr>
-        <w:t>Figure 4</w:t>
+        <w:t>Figure 3</w:t>
       </w:r>
       <w:r>
         <w:rPr>
@@ -8795,7 +8556,7 @@
           <w:bCs/>
           <w:lang w:val="en-US"/>
         </w:rPr>
-        <w:t>Figure 4</w:t>
+        <w:t>Figure 3</w:t>
       </w:r>
       <w:r>
         <w:rPr>
@@ -8948,7 +8709,7 @@
           <w:bCs/>
           <w:lang w:val="en-US"/>
         </w:rPr>
-        <w:t>Figure 4</w:t>
+        <w:t>Figure 3</w:t>
       </w:r>
       <w:r>
         <w:rPr>
@@ -9090,7 +8851,7 @@
           <w:bCs/>
           <w:lang w:val="en-US"/>
         </w:rPr>
-        <w:t>Figure 4</w:t>
+        <w:t>Figure 3</w:t>
       </w:r>
       <w:r>
         <w:rPr>
@@ -9213,7 +8974,7 @@
           <w:bCs/>
           <w:lang w:val="en-US"/>
         </w:rPr>
-        <w:t>Figure 4</w:t>
+        <w:t>Figure 3</w:t>
       </w:r>
       <w:r>
         <w:rPr>
@@ -9367,7 +9128,7 @@
           <w:bCs/>
           <w:lang w:val="en-US"/>
         </w:rPr>
-        <w:t>Figure 4</w:t>
+        <w:t>Figure 3</w:t>
       </w:r>
       <w:r>
         <w:rPr>
@@ -9495,7 +9256,7 @@
           <w:bCs/>
           <w:lang w:val="en-US"/>
         </w:rPr>
-        <w:t>Figure 4</w:t>
+        <w:t>Figure 3</w:t>
       </w:r>
       <w:r>
         <w:rPr>
@@ -9620,7 +9381,7 @@
           <w:bCs/>
           <w:lang w:val="en-US"/>
         </w:rPr>
-        <w:t>Figure 4</w:t>
+        <w:t>Figure 3</w:t>
       </w:r>
       <w:r>
         <w:rPr>
@@ -9890,7 +9651,7 @@
           <w:bCs/>
           <w:lang w:val="en-US"/>
         </w:rPr>
-        <w:t>Figure 4</w:t>
+        <w:t>Figure 3</w:t>
       </w:r>
       <w:r>
         <w:rPr>
@@ -10110,7 +9871,7 @@
           <w:bCs/>
           <w:lang w:val="en-US"/>
         </w:rPr>
-        <w:t>Figure 4</w:t>
+        <w:t>Figure 3</w:t>
       </w:r>
       <w:r>
         <w:rPr>
@@ -10258,7 +10019,7 @@
           <w:bCs/>
           <w:lang w:val="en-US"/>
         </w:rPr>
-        <w:t>Figure 4</w:t>
+        <w:t>Figure 3</w:t>
       </w:r>
       <w:r>
         <w:rPr>
@@ -10414,7 +10175,7 @@
           <w:noProof/>
           <w:lang w:val="en-US"/>
         </w:rPr>
-        <w:t>4</w:t>
+        <w:t>3</w:t>
       </w:r>
       <w:r>
         <w:rPr>
@@ -11788,7 +11549,7 @@
           <w:bCs/>
           <w:lang w:val="en-US"/>
         </w:rPr>
-        <w:t>Figure 5</w:t>
+        <w:t>Figure 4</w:t>
       </w:r>
       <w:r>
         <w:rPr>
@@ -11931,7 +11692,7 @@
           <w:bCs/>
           <w:lang w:val="en-US"/>
         </w:rPr>
-        <w:t>Figure 5</w:t>
+        <w:t>Figure 4</w:t>
       </w:r>
       <w:r>
         <w:rPr>
@@ -12129,7 +11890,7 @@
           <w:bCs/>
           <w:lang w:val="en-US"/>
         </w:rPr>
-        <w:t>Figure 5</w:t>
+        <w:t>Figure 4</w:t>
       </w:r>
       <w:r>
         <w:rPr>
@@ -12211,7 +11972,7 @@
           <w:bCs/>
           <w:lang w:val="en-US"/>
         </w:rPr>
-        <w:t>Figure 5</w:t>
+        <w:t>Figure 4</w:t>
       </w:r>
       <w:r>
         <w:rPr>
@@ -12421,7 +12182,7 @@
           <w:noProof/>
           <w:lang w:val="en-US"/>
         </w:rPr>
-        <w:t>5</w:t>
+        <w:t>4</w:t>
       </w:r>
       <w:r>
         <w:rPr>
@@ -12843,7 +12604,7 @@
           <w:bCs/>
           <w:lang w:val="en-US"/>
         </w:rPr>
-        <w:t>Figure 5</w:t>
+        <w:t>Figure 4</w:t>
       </w:r>
       <w:r>
         <w:rPr>
@@ -13062,7 +12823,7 @@
           <w:bCs/>
           <w:lang w:val="en-US"/>
         </w:rPr>
-        <w:t>Figure 6</w:t>
+        <w:t>Figure 5</w:t>
       </w:r>
       <w:r>
         <w:rPr>
@@ -13303,7 +13064,7 @@
           <w:bCs/>
           <w:lang w:val="en-US"/>
         </w:rPr>
-        <w:t>Figure 6</w:t>
+        <w:t>Figure 5</w:t>
       </w:r>
       <w:r>
         <w:rPr>
@@ -13484,7 +13245,7 @@
           <w:noProof/>
           <w:lang w:val="en-US"/>
         </w:rPr>
-        <w:t>6</w:t>
+        <w:t>5</w:t>
       </w:r>
       <w:r>
         <w:rPr>
@@ -13618,7 +13379,7 @@
           <w:bCs/>
           <w:lang w:val="en-US"/>
         </w:rPr>
-        <w:t>Figure 7</w:t>
+        <w:t>Figure 6</w:t>
       </w:r>
       <w:r>
         <w:rPr>
@@ -13683,7 +13444,7 @@
           <w:bCs/>
           <w:lang w:val="en-US"/>
         </w:rPr>
-        <w:t>Figure 7</w:t>
+        <w:t>Figure 6</w:t>
       </w:r>
       <w:r>
         <w:rPr>
@@ -13711,7 +13472,7 @@
         <w:rPr>
           <w:lang w:val="en-US"/>
         </w:rPr>
-        <w:t xml:space="preserve">Because no spatial variation in corrosion kinetics was prescribed, this heterogeneous degradation arose from the coupled effects of geometry, oxygen transport, corrosion-product accumulation, and interface recession. Oxygen availability remained higher along the outward-facing crown surfaces, which were exposed to the surrounding electrolyte and supplied from multiple directions, whereas transport to the inner-curvature regions was progressively restricted by geometric confinement and corrosion-product accumulation (Figure 7b; Section S7).</w:t>
+        <w:t xml:space="preserve">Because no spatial variation in corrosion kinetics was prescribed, this heterogeneous degradation arose from the coupled effects of geometry, oxygen transport, corrosion-product accumulation, and interface recession. Oxygen availability remained higher along the outward-facing crown surfaces, which were exposed to the surrounding electrolyte and supplied from multiple directions, whereas transport to the inner-curvature regions was progressively restricted by geometric confinement and corrosion-product accumulation (Figure 6b; Section S7).</w:t>
       </w:r>
       <w:r>
         <w:rPr>
@@ -13843,7 +13604,7 @@
           <w:bCs/>
           <w:lang w:val="en-US"/>
         </w:rPr>
-        <w:t>Figure 7</w:t>
+        <w:t>Figure 6</w:t>
       </w:r>
       <w:r>
         <w:rPr>
@@ -13951,7 +13712,7 @@
           <w:bCs/>
           <w:lang w:val="en-US"/>
         </w:rPr>
-        <w:t>Figure 7</w:t>
+        <w:t>Figure 6</w:t>
       </w:r>
       <w:r>
         <w:rPr>
@@ -14090,7 +13851,7 @@
           <w:bCs/>
           <w:lang w:val="en-US"/>
         </w:rPr>
-        <w:t>Figure 7</w:t>
+        <w:t>Figure 6</w:t>
       </w:r>
       <w:r>
         <w:rPr>
@@ -14252,7 +14013,7 @@
           <w:noProof/>
           <w:lang w:val="en-US"/>
         </w:rPr>
-        <w:t>7</w:t>
+        <w:t>6</w:t>
       </w:r>
       <w:r>
         <w:rPr>
@@ -14386,7 +14147,7 @@
           <w:bCs/>
           <w:lang w:val="en-US"/>
         </w:rPr>
-        <w:t xml:space="preserve">Figure </w:t>
+        <w:t xml:space="preserve">Figure 7</w:t>
       </w:r>
       <w:r>
         <w:rPr>
@@ -14395,7 +14156,7 @@
           <w:noProof/>
           <w:lang w:val="en-US"/>
         </w:rPr>
-        <w:t>8</w:t>
+        <w:t/>
       </w:r>
       <w:r>
         <w:rPr>
@@ -14476,7 +14237,7 @@
           <w:bCs/>
           <w:lang w:val="en-US"/>
         </w:rPr>
-        <w:t xml:space="preserve">Figure </w:t>
+        <w:t xml:space="preserve">Figure 7</w:t>
       </w:r>
       <w:r>
         <w:rPr>
@@ -14485,7 +14246,7 @@
           <w:noProof/>
           <w:lang w:val="en-US"/>
         </w:rPr>
-        <w:t>8</w:t>
+        <w:t/>
       </w:r>
       <w:r>
         <w:rPr>
@@ -14625,7 +14386,7 @@
           <w:bCs/>
           <w:lang w:val="en-US"/>
         </w:rPr>
-        <w:t>Figure 8c</w:t>
+        <w:t>Figure 7c</w:t>
       </w:r>
       <w:r>
         <w:rPr>
@@ -14651,7 +14412,7 @@
           <w:bCs/>
           <w:lang w:val="en-US"/>
         </w:rPr>
-        <w:t>Figure 8d</w:t>
+        <w:t>Figure 7d</w:t>
       </w:r>
       <w:r>
         <w:rPr>
@@ -14786,7 +14547,7 @@
           <w:noProof/>
           <w:lang w:val="en-US"/>
         </w:rPr>
-        <w:t>8</w:t>
+        <w:t>7</w:t>
       </w:r>
       <w:r>
         <w:rPr>
@@ -15462,7 +15223,7 @@
           <w:bCs/>
           <w:lang w:val="en-US"/>
         </w:rPr>
-        <w:t>Figure 2</w:t>
+        <w:t>Figure 8</w:t>
       </w:r>
       <w:r>
         <w:rPr>
@@ -17119,6 +16880,187 @@
         </w:rPr>
         <w:t xml:space="preserve"> phase.</w:t>
       </w:r>
+    </w:p>
+    <w:p>
+      <w:pPr>
+        <w:pStyle w:val="CaptionedFigure"/>
+        <w:keepNext/>
+        <w:ind w:firstLine="0"/>
+        <w:jc w:val="center"/>
+        <w:rPr>
+          <w:lang w:val="en-US"/>
+        </w:rPr>
+      </w:pPr>
+      <w:bookmarkStart w:id="4" w:name="fig:chemistry"/>
+      <w:bookmarkEnd w:id="3"/>
+      <w:r>
+        <w:rPr>
+          <w:noProof/>
+          <w:lang w:val="en-US"/>
+        </w:rPr>
+        <w:drawing>
+          <wp:inline distT="0" distB="0" distL="0" distR="0" wp14:anchorId="6B2B0989" wp14:editId="2B16D036">
+            <wp:extent cx="5760720" cy="4340225"/>
+            <wp:effectExtent l="0" t="0" r="0" b="3175"/>
+            <wp:docPr id="10" name="Picture 10"/>
+            <wp:cNvGraphicFramePr>
+              <a:graphicFrameLocks xmlns:a="http://schemas.openxmlformats.org/drawingml/2006/main" noChangeAspect="1"/>
+            </wp:cNvGraphicFramePr>
+            <a:graphic xmlns:a="http://schemas.openxmlformats.org/drawingml/2006/main">
+              <a:graphicData uri="http://schemas.openxmlformats.org/drawingml/2006/picture">
+                <pic:pic xmlns:pic="http://schemas.openxmlformats.org/drawingml/2006/picture">
+                  <pic:nvPicPr>
+                    <pic:cNvPr id="10" name="Picture 10"/>
+                    <pic:cNvPicPr/>
+                  </pic:nvPicPr>
+                  <pic:blipFill>
+                    <a:blip r:embed="rId16" cstate="print">
+                      <a:extLst>
+                        <a:ext uri="{28A0092B-C50C-407E-A947-70E740481C1C}">
+                          <a14:useLocalDpi xmlns:a14="http://schemas.microsoft.com/office/drawing/2010/main" val="0"/>
+                        </a:ext>
+                      </a:extLst>
+                    </a:blip>
+                    <a:stretch>
+                      <a:fillRect/>
+                    </a:stretch>
+                  </pic:blipFill>
+                  <pic:spPr>
+                    <a:xfrm>
+                      <a:off x="0" y="0"/>
+                      <a:ext cx="5760720" cy="4340225"/>
+                    </a:xfrm>
+                    <a:prstGeom prst="rect">
+                      <a:avLst/>
+                    </a:prstGeom>
+                  </pic:spPr>
+                </pic:pic>
+              </a:graphicData>
+            </a:graphic>
+          </wp:inline>
+        </w:drawing>
+      </w:r>
+    </w:p>
+    <w:p>
+      <w:pPr>
+        <w:pStyle w:val="Captions"/>
+        <w:rPr>
+          <w:lang w:val="en-US"/>
+        </w:rPr>
+      </w:pPr>
+      <w:bookmarkStart w:id="5" w:name="_Ref238652979"/>
+      <w:r>
+        <w:rPr>
+          <w:b/>
+          <w:bCs/>
+          <w:lang w:val="en-US"/>
+        </w:rPr>
+        <w:t>Fig</w:t>
+      </w:r>
+      <w:r>
+        <w:rPr>
+          <w:b/>
+          <w:bCs/>
+          <w:lang w:val="en-US"/>
+        </w:rPr>
+        <w:t>ure</w:t>
+      </w:r>
+      <w:r>
+        <w:rPr>
+          <w:b/>
+          <w:bCs/>
+          <w:lang w:val="en-US"/>
+        </w:rPr>
+        <w:t xml:space="preserve"> </w:t>
+      </w:r>
+      <w:r>
+        <w:rPr>
+          <w:b/>
+          <w:bCs/>
+          <w:lang w:val="en-US"/>
+        </w:rPr>
+        <w:fldChar w:fldCharType="begin"/>
+      </w:r>
+      <w:r>
+        <w:rPr>
+          <w:b/>
+          <w:bCs/>
+          <w:lang w:val="en-US"/>
+        </w:rPr>
+        <w:instrText xml:space="preserve"> SEQ Fig._ \* ARABIC </w:instrText>
+      </w:r>
+      <w:r>
+        <w:rPr>
+          <w:b/>
+          <w:bCs/>
+          <w:lang w:val="en-US"/>
+        </w:rPr>
+        <w:fldChar w:fldCharType="separate"/>
+      </w:r>
+      <w:r>
+        <w:rPr>
+          <w:b/>
+          <w:bCs/>
+          <w:noProof/>
+          <w:lang w:val="en-US"/>
+        </w:rPr>
+        <w:t>8</w:t>
+      </w:r>
+      <w:r>
+        <w:rPr>
+          <w:b/>
+          <w:bCs/>
+          <w:lang w:val="en-US"/>
+        </w:rPr>
+        <w:fldChar w:fldCharType="end"/>
+      </w:r>
+      <w:bookmarkEnd w:id="5"/>
+      <w:r>
+        <w:rPr>
+          <w:b/>
+          <w:bCs/>
+          <w:lang w:val="en-US"/>
+        </w:rPr>
+        <w:t>.</w:t>
+      </w:r>
+      <w:r>
+        <w:rPr>
+          <w:lang w:val="en-US"/>
+        </w:rPr>
+        <w:t xml:space="preserve"> </w:t>
+      </w:r>
+      <w:r>
+        <w:rPr>
+          <w:lang w:val="en-US"/>
+        </w:rPr>
+        <w:t>Schematic of the coupled mechanistic framework for Zn biodegradation in physiological media. (a) Electrochemical reactions governing Zn dissolution, oxygen reduction, film formation, and chloride-induced film breakdown, (</w:t>
+      </w:r>
+      <w:r>
+        <w:rPr>
+          <w:lang w:val="en-US"/>
+        </w:rPr>
+        <w:t>b</w:t>
+      </w:r>
+      <w:r>
+        <w:rPr>
+          <w:lang w:val="en-US"/>
+        </w:rPr>
+        <w:t>) porous corrosion-product film structure showing the influence of porosity and tortuosity on effective species diffusion</w:t>
+      </w:r>
+      <w:r>
+        <w:rPr>
+          <w:lang w:val="en-US"/>
+        </w:rPr>
+        <w:t>, (c) level-set tracking of the moving metal-electrolyte interface and associated species transport.</w:t>
+      </w:r>
+    </w:p>
+    <w:p>
+      <w:pPr>
+        <w:pStyle w:val="Captions"/>
+        <w:rPr>
+          <w:lang w:val="en-US"/>
+        </w:rPr>
+      </w:pPr>
     </w:p>
     <w:p>
       <w:pPr>
@@ -21401,7 +21343,7 @@
           <w:bCs/>
           <w:lang w:val="en-US"/>
         </w:rPr>
-        <w:t xml:space="preserve">Figure </w:t>
+        <w:t xml:space="preserve">Figure 8</w:t>
       </w:r>
       <w:r>
         <w:rPr>
@@ -21410,7 +21352,7 @@
           <w:noProof/>
           <w:lang w:val="en-US"/>
         </w:rPr>
-        <w:t>2</w:t>
+        <w:t/>
       </w:r>
       <w:r>
         <w:rPr>
@@ -21552,7 +21494,7 @@
           <w:bCs/>
           <w:lang w:val="en-US"/>
         </w:rPr>
-        <w:t xml:space="preserve">Figure </w:t>
+        <w:t xml:space="preserve">Figure 8</w:t>
       </w:r>
       <w:r>
         <w:rPr>
@@ -21561,7 +21503,7 @@
           <w:noProof/>
           <w:lang w:val="en-US"/>
         </w:rPr>
-        <w:t>2</w:t>
+        <w:t/>
       </w:r>
       <w:r>
         <w:rPr>

</xml_diff>